<commit_message>
bring in lab 3 stuff
</commit_message>
<xml_diff>
--- a/Acoustics/Acoustics Lab Report 2.docx
+++ b/Acoustics/Acoustics Lab Report 2.docx
@@ -171,7 +171,7 @@
           <w:szCs w:val="28"/>
         </w:rPr>
       </w:pPr>
-      <w:hyperlink r:id="rId6" w:history="1">
+      <w:hyperlink r:id="rId8" w:history="1">
         <w:r>
           <w:rPr>
             <w:rStyle w:val="Hyperlink"/>
@@ -1277,6 +1277,7 @@
       </w:pPr>
       <w:r>
         <w:rPr>
+          <w:noProof/>
           <w:sz w:val="36"/>
           <w:szCs w:val="36"/>
         </w:rPr>
@@ -1296,7 +1297,7 @@
                     <pic:cNvPicPr/>
                   </pic:nvPicPr>
                   <pic:blipFill>
-                    <a:blip r:embed="rId7"/>
+                    <a:blip r:embed="rId9"/>
                     <a:stretch>
                       <a:fillRect/>
                     </a:stretch>
@@ -1425,21 +1426,7 @@
           <w:sz w:val="28"/>
           <w:szCs w:val="28"/>
         </w:rPr>
-        <w:t>A speaker is a beautiful electromechanical system. Magnetic force is exerted when AC current f lows through a coil of wire in a magnetic</w:t>
-      </w:r>
-      <w:r>
-        <w:rPr>
-          <w:sz w:val="28"/>
-          <w:szCs w:val="28"/>
-        </w:rPr>
-        <w:t xml:space="preserve"> </w:t>
-      </w:r>
-      <w:r>
-        <w:rPr>
-          <w:sz w:val="28"/>
-          <w:szCs w:val="28"/>
-        </w:rPr>
-        <w:t>field. The coil is attached to a paper cone which is connected to a flexible surround and finally to the speaker frame. The flexible surround has a spring constant and the wire coil plus cone has a mass so you can imagine there will be a resonance frequency for the system in addition to mechanical damping. The first part of this lab will be devoted to finding this resonance frequency and the second to determining the mechanical damping.</w:t>
+        <w:t>A speaker is a beautiful electromechanical system. Magnetic force is exerted when AC current f lows through a coil of wire in a magnetic field. The coil is attached to a paper cone which is connected to a flexible surround and finally to the speaker frame. The flexible surround has a spring constant and the wire coil plus cone has a mass so you can imagine there will be a resonance frequency for the system in addition to mechanical damping. The first part of this lab will be devoted to finding this resonance frequency and the second to determining the mechanical damping.</w:t>
       </w:r>
     </w:p>
     <w:p>
@@ -1621,6 +1608,9 @@
         <w:sdtContent>
           <m:oMath>
             <m:r>
+              <m:rPr>
+                <m:sty m:val="p"/>
+              </m:rPr>
               <w:rPr>
                 <w:rStyle w:val="PlaceholderText"/>
                 <w:rFonts w:ascii="Cambria Math" w:hAnsi="Cambria Math"/>
@@ -1682,6 +1672,9 @@
         <w:sdtContent>
           <m:oMath>
             <m:r>
+              <m:rPr>
+                <m:sty m:val="p"/>
+              </m:rPr>
               <w:rPr>
                 <w:rStyle w:val="PlaceholderText"/>
                 <w:rFonts w:ascii="Cambria Math" w:hAnsi="Cambria Math"/>
@@ -1713,7 +1706,23 @@
           <w:sz w:val="28"/>
           <w:szCs w:val="28"/>
         </w:rPr>
-        <w:t>This can be rearranged and solved for the period-squared</w:t>
+        <w:t xml:space="preserve">This can be rearranged and solved for </w:t>
+      </w:r>
+      <w:proofErr w:type="gramStart"/>
+      <w:r>
+        <w:rPr>
+          <w:sz w:val="28"/>
+          <w:szCs w:val="28"/>
+        </w:rPr>
+        <w:t>the period</w:t>
+      </w:r>
+      <w:proofErr w:type="gramEnd"/>
+      <w:r>
+        <w:rPr>
+          <w:sz w:val="28"/>
+          <w:szCs w:val="28"/>
+        </w:rPr>
+        <w:t>-squared</w:t>
       </w:r>
       <w:r>
         <w:rPr>
@@ -1747,10 +1756,12 @@
           <w:showingPlcHdr/>
           <w:equation/>
         </w:sdtPr>
-        <w:sdtEndPr/>
         <w:sdtContent>
           <m:oMath>
             <m:r>
+              <m:rPr>
+                <m:sty m:val="p"/>
+              </m:rPr>
               <w:rPr>
                 <w:rStyle w:val="PlaceholderText"/>
                 <w:rFonts w:ascii="Cambria Math" w:hAnsi="Cambria Math"/>
@@ -2366,7 +2377,7 @@
           <w:szCs w:val="36"/>
           <w:u w:val="single"/>
         </w:rPr>
-        <w:t>Mechanical Resistance/ Free Decay</w:t>
+        <w:t>Mechanical Resistance/ Free Decay Procedure</w:t>
       </w:r>
       <w:r>
         <w:rPr>
@@ -2374,14 +2385,6 @@
           <w:szCs w:val="36"/>
           <w:u w:val="single"/>
         </w:rPr>
-        <w:t xml:space="preserve"> Procedure</w:t>
-      </w:r>
-      <w:r>
-        <w:rPr>
-          <w:sz w:val="36"/>
-          <w:szCs w:val="36"/>
-          <w:u w:val="single"/>
-        </w:rPr>
         <w:t xml:space="preserve">: </w:t>
       </w:r>
     </w:p>
@@ -2421,7 +2424,23 @@
           <w:sz w:val="28"/>
           <w:szCs w:val="28"/>
         </w:rPr>
-        <w:t xml:space="preserve">, the o-scope has to trigger on the signal from the switch box. </w:t>
+        <w:t xml:space="preserve">, the o-scope </w:t>
+      </w:r>
+      <w:proofErr w:type="gramStart"/>
+      <w:r>
+        <w:rPr>
+          <w:sz w:val="28"/>
+          <w:szCs w:val="28"/>
+        </w:rPr>
+        <w:t>has to</w:t>
+      </w:r>
+      <w:proofErr w:type="gramEnd"/>
+      <w:r>
+        <w:rPr>
+          <w:sz w:val="28"/>
+          <w:szCs w:val="28"/>
+        </w:rPr>
+        <w:t xml:space="preserve"> trigger on the signal from the switch box. </w:t>
       </w:r>
     </w:p>
     <w:p>
@@ -2454,7 +2473,23 @@
           <w:sz w:val="28"/>
           <w:szCs w:val="28"/>
         </w:rPr>
-        <w:t xml:space="preserve">Press the “Mode/Coupling” button, then use the ”soft keys” to the right of the display to choose the following options. </w:t>
+        <w:t xml:space="preserve">Press the “Mode/Coupling” button, then use </w:t>
+      </w:r>
+      <w:proofErr w:type="gramStart"/>
+      <w:r>
+        <w:rPr>
+          <w:sz w:val="28"/>
+          <w:szCs w:val="28"/>
+        </w:rPr>
+        <w:t>the ”soft</w:t>
+      </w:r>
+      <w:proofErr w:type="gramEnd"/>
+      <w:r>
+        <w:rPr>
+          <w:sz w:val="28"/>
+          <w:szCs w:val="28"/>
+        </w:rPr>
+        <w:t xml:space="preserve"> keys” to the right of the display to choose the following options. </w:t>
       </w:r>
       <w:proofErr w:type="spellStart"/>
       <w:r>
@@ -2524,21 +2559,7 @@
           <w:sz w:val="28"/>
           <w:szCs w:val="28"/>
         </w:rPr>
-        <w:t xml:space="preserve">Use the “Horizontal” knob to increase the sweep time to 20 msec/div so that more of the exponentially decaying waveform will </w:t>
-      </w:r>
-      <w:r>
-        <w:rPr>
-          <w:sz w:val="28"/>
-          <w:szCs w:val="28"/>
-        </w:rPr>
-        <w:t>be</w:t>
-      </w:r>
-      <w:r>
-        <w:rPr>
-          <w:sz w:val="28"/>
-          <w:szCs w:val="28"/>
-        </w:rPr>
-        <w:t xml:space="preserve"> displayed.</w:t>
+        <w:t>Use the “Horizontal” knob to increase the sweep time to 20 msec/div so that more of the exponentially decaying waveform will be displayed.</w:t>
       </w:r>
     </w:p>
     <w:p>
@@ -2689,8 +2710,33 @@
           <w:sz w:val="28"/>
           <w:szCs w:val="28"/>
         </w:rPr>
-        <w:t>used to calculate the mechanical resistance through the use of</w:t>
-      </w:r>
+        <w:t xml:space="preserve">used to calculate </w:t>
+      </w:r>
+      <w:proofErr w:type="gramStart"/>
+      <w:r>
+        <w:rPr>
+          <w:sz w:val="28"/>
+          <w:szCs w:val="28"/>
+        </w:rPr>
+        <w:t>the mechanical</w:t>
+      </w:r>
+      <w:proofErr w:type="gramEnd"/>
+      <w:r>
+        <w:rPr>
+          <w:sz w:val="28"/>
+          <w:szCs w:val="28"/>
+        </w:rPr>
+        <w:t xml:space="preserve"> resistance </w:t>
+      </w:r>
+      <w:proofErr w:type="gramStart"/>
+      <w:r>
+        <w:rPr>
+          <w:sz w:val="28"/>
+          <w:szCs w:val="28"/>
+        </w:rPr>
+        <w:t>through the use of</w:t>
+      </w:r>
+      <w:proofErr w:type="gramEnd"/>
       <w:r>
         <w:rPr>
           <w:sz w:val="28"/>
@@ -2717,6 +2763,9 @@
         <w:sdtContent>
           <m:oMath>
             <m:r>
+              <m:rPr>
+                <m:sty m:val="p"/>
+              </m:rPr>
               <w:rPr>
                 <w:rStyle w:val="PlaceholderText"/>
                 <w:rFonts w:ascii="Cambria Math" w:hAnsi="Cambria Math"/>
@@ -2961,7 +3010,7 @@
                     <pic:cNvPicPr/>
                   </pic:nvPicPr>
                   <pic:blipFill>
-                    <a:blip r:embed="rId8">
+                    <a:blip r:embed="rId10">
                       <a:extLst>
                         <a:ext uri="{28A0092B-C50C-407E-A947-70E740481C1C}">
                           <a14:useLocalDpi xmlns:a14="http://schemas.microsoft.com/office/drawing/2010/main" val="0"/>
@@ -3052,7 +3101,7 @@
           <w:u w:val="single"/>
         </w:rPr>
         <w:lastRenderedPageBreak/>
-        <w:t xml:space="preserve"> </w:t>
+        <w:t xml:space="preserve"> Effective Mass &amp; Stiffness</w:t>
       </w:r>
       <w:r>
         <w:rPr>
@@ -3060,14 +3109,6 @@
           <w:szCs w:val="36"/>
           <w:u w:val="single"/>
         </w:rPr>
-        <w:t>Effective Mass &amp; Stiffness</w:t>
-      </w:r>
-      <w:r>
-        <w:rPr>
-          <w:sz w:val="36"/>
-          <w:szCs w:val="36"/>
-          <w:u w:val="single"/>
-        </w:rPr>
         <w:t xml:space="preserve"> Results:  </w:t>
       </w:r>
     </w:p>
@@ -3167,14 +3208,46 @@
           <w:sz w:val="24"/>
           <w:szCs w:val="24"/>
         </w:rPr>
-        <w:t xml:space="preserve">stated clearly I gave the .csv files to it and it wrote the code to create detailed plots of my data. </w:t>
-      </w:r>
-      <w:r>
-        <w:rPr>
-          <w:sz w:val="24"/>
-          <w:szCs w:val="24"/>
-        </w:rPr>
-        <w:t>In addition to this, I also gave it the necessary theory and equations to use and it wrote the code to calculate the effective mass and spring constant</w:t>
+        <w:t xml:space="preserve">stated </w:t>
+      </w:r>
+      <w:proofErr w:type="gramStart"/>
+      <w:r>
+        <w:rPr>
+          <w:sz w:val="24"/>
+          <w:szCs w:val="24"/>
+        </w:rPr>
+        <w:t>clearly</w:t>
+      </w:r>
+      <w:proofErr w:type="gramEnd"/>
+      <w:r>
+        <w:rPr>
+          <w:sz w:val="24"/>
+          <w:szCs w:val="24"/>
+        </w:rPr>
+        <w:t xml:space="preserve"> I gave the .csv files to it and it wrote the code to create detailed plots of my data. </w:t>
+      </w:r>
+      <w:r>
+        <w:rPr>
+          <w:sz w:val="24"/>
+          <w:szCs w:val="24"/>
+        </w:rPr>
+        <w:t xml:space="preserve">In addition to this, I also gave it the necessary theory and equations to </w:t>
+      </w:r>
+      <w:proofErr w:type="gramStart"/>
+      <w:r>
+        <w:rPr>
+          <w:sz w:val="24"/>
+          <w:szCs w:val="24"/>
+        </w:rPr>
+        <w:t>use</w:t>
+      </w:r>
+      <w:proofErr w:type="gramEnd"/>
+      <w:r>
+        <w:rPr>
+          <w:sz w:val="24"/>
+          <w:szCs w:val="24"/>
+        </w:rPr>
+        <w:t xml:space="preserve"> and it wrote the code to calculate the effective mass and spring constant</w:t>
       </w:r>
       <w:r>
         <w:rPr>
@@ -3334,6 +3407,7 @@
         </w:rPr>
         <w:tab/>
       </w:r>
+      <w:proofErr w:type="gramStart"/>
       <w:r>
         <w:rPr>
           <w:sz w:val="24"/>
@@ -3347,7 +3421,15 @@
           <w:sz w:val="24"/>
           <w:szCs w:val="24"/>
         </w:rPr>
-        <w:t>0.017220 ± 0.000169 s²/kg</w:t>
+        <w:t>0.017220</w:t>
+      </w:r>
+      <w:proofErr w:type="gramEnd"/>
+      <w:r>
+        <w:rPr>
+          <w:sz w:val="24"/>
+          <w:szCs w:val="24"/>
+        </w:rPr>
+        <w:t xml:space="preserve"> ± 0.000169 s²/kg</w:t>
       </w:r>
     </w:p>
     <w:p>
@@ -3392,6 +3474,7 @@
         </w:rPr>
         <w:tab/>
       </w:r>
+      <w:proofErr w:type="gramStart"/>
       <w:r>
         <w:rPr>
           <w:sz w:val="24"/>
@@ -3405,7 +3488,15 @@
           <w:sz w:val="24"/>
           <w:szCs w:val="24"/>
         </w:rPr>
-        <w:t>0.000615 s²</w:t>
+        <w:t>0.000615</w:t>
+      </w:r>
+      <w:proofErr w:type="gramEnd"/>
+      <w:r>
+        <w:rPr>
+          <w:sz w:val="24"/>
+          <w:szCs w:val="24"/>
+        </w:rPr>
+        <w:t xml:space="preserve"> s²</w:t>
       </w:r>
     </w:p>
     <w:p>
@@ -3450,6 +3541,7 @@
         </w:rPr>
         <w:tab/>
       </w:r>
+      <w:proofErr w:type="gramStart"/>
       <w:r>
         <w:rPr>
           <w:sz w:val="24"/>
@@ -3465,6 +3557,7 @@
         </w:rPr>
         <w:t>0.999521</w:t>
       </w:r>
+      <w:proofErr w:type="gramEnd"/>
     </w:p>
     <w:p>
       <w:pPr>
@@ -3501,6 +3594,7 @@
         </w:rPr>
         <w:tab/>
       </w:r>
+      <w:proofErr w:type="gramStart"/>
       <w:r>
         <w:rPr>
           <w:sz w:val="24"/>
@@ -3514,7 +3608,15 @@
           <w:sz w:val="24"/>
           <w:szCs w:val="24"/>
         </w:rPr>
-        <w:t>2292.56 ± 22.44 N/m</w:t>
+        <w:t>2292.56</w:t>
+      </w:r>
+      <w:proofErr w:type="gramEnd"/>
+      <w:r>
+        <w:rPr>
+          <w:sz w:val="24"/>
+          <w:szCs w:val="24"/>
+        </w:rPr>
+        <w:t xml:space="preserve"> ± 22.44 N/m</w:t>
       </w:r>
     </w:p>
     <w:p>
@@ -3552,6 +3654,7 @@
         </w:rPr>
         <w:tab/>
       </w:r>
+      <w:proofErr w:type="gramStart"/>
       <w:r>
         <w:rPr>
           <w:sz w:val="24"/>
@@ -3565,7 +3668,15 @@
           <w:sz w:val="24"/>
           <w:szCs w:val="24"/>
         </w:rPr>
-        <w:t>35.72 ± 1.79 g</w:t>
+        <w:t>35.72</w:t>
+      </w:r>
+      <w:proofErr w:type="gramEnd"/>
+      <w:r>
+        <w:rPr>
+          <w:sz w:val="24"/>
+          <w:szCs w:val="24"/>
+        </w:rPr>
+        <w:t xml:space="preserve"> ± 1.79 g</w:t>
       </w:r>
     </w:p>
     <w:p>
@@ -3622,6 +3733,7 @@
         </w:rPr>
         <w:tab/>
       </w:r>
+      <w:proofErr w:type="gramStart"/>
       <w:r>
         <w:rPr>
           <w:sz w:val="24"/>
@@ -3635,7 +3747,15 @@
           <w:sz w:val="24"/>
           <w:szCs w:val="24"/>
         </w:rPr>
-        <w:t>40.32 Hz</w:t>
+        <w:t>40.32</w:t>
+      </w:r>
+      <w:proofErr w:type="gramEnd"/>
+      <w:r>
+        <w:rPr>
+          <w:sz w:val="24"/>
+          <w:szCs w:val="24"/>
+        </w:rPr>
+        <w:t xml:space="preserve"> Hz</w:t>
       </w:r>
     </w:p>
     <w:p>
@@ -4468,7 +4588,7 @@
                     <pic:cNvPicPr/>
                   </pic:nvPicPr>
                   <pic:blipFill>
-                    <a:blip r:embed="rId9">
+                    <a:blip r:embed="rId11">
                       <a:extLst>
                         <a:ext uri="{28A0092B-C50C-407E-A947-70E740481C1C}">
                           <a14:useLocalDpi xmlns:a14="http://schemas.microsoft.com/office/drawing/2010/main" val="0"/>
@@ -4740,7 +4860,23 @@
           <w:sz w:val="24"/>
           <w:szCs w:val="24"/>
         </w:rPr>
-        <w:t xml:space="preserve">f₀ (Hz)       </w:t>
+        <w:t>f₀ (</w:t>
+      </w:r>
+      <w:proofErr w:type="gramStart"/>
+      <w:r>
+        <w:rPr>
+          <w:sz w:val="24"/>
+          <w:szCs w:val="24"/>
+        </w:rPr>
+        <w:t xml:space="preserve">Hz)   </w:t>
+      </w:r>
+      <w:proofErr w:type="gramEnd"/>
+      <w:r>
+        <w:rPr>
+          <w:sz w:val="24"/>
+          <w:szCs w:val="24"/>
+        </w:rPr>
+        <w:t xml:space="preserve">    </w:t>
       </w:r>
       <w:r>
         <w:rPr>
@@ -4754,7 +4890,23 @@
           <w:sz w:val="24"/>
           <w:szCs w:val="24"/>
         </w:rPr>
-        <w:t xml:space="preserve">m₀ (g)           </w:t>
+        <w:t>m₀ (</w:t>
+      </w:r>
+      <w:proofErr w:type="gramStart"/>
+      <w:r>
+        <w:rPr>
+          <w:sz w:val="24"/>
+          <w:szCs w:val="24"/>
+        </w:rPr>
+        <w:t xml:space="preserve">g)   </w:t>
+      </w:r>
+      <w:proofErr w:type="gramEnd"/>
+      <w:r>
+        <w:rPr>
+          <w:sz w:val="24"/>
+          <w:szCs w:val="24"/>
+        </w:rPr>
+        <w:t xml:space="preserve">        </w:t>
       </w:r>
       <w:r>
         <w:rPr>
@@ -5618,15 +5770,7 @@
           <w:szCs w:val="36"/>
           <w:u w:val="single"/>
         </w:rPr>
-        <w:t>:</w:t>
-      </w:r>
-      <w:r>
-        <w:rPr>
-          <w:sz w:val="36"/>
-          <w:szCs w:val="36"/>
-          <w:u w:val="single"/>
-        </w:rPr>
-        <w:t xml:space="preserve">  </w:t>
+        <w:t xml:space="preserve">:  </w:t>
       </w:r>
     </w:p>
     <w:p>
@@ -5665,7 +5809,23 @@
           <w:sz w:val="24"/>
           <w:szCs w:val="24"/>
         </w:rPr>
-        <w:t xml:space="preserve">a .csv file. The results of this part are similar to the results above. </w:t>
+        <w:t xml:space="preserve">a .csv file. The results of this part are </w:t>
+      </w:r>
+      <w:proofErr w:type="gramStart"/>
+      <w:r>
+        <w:rPr>
+          <w:sz w:val="24"/>
+          <w:szCs w:val="24"/>
+        </w:rPr>
+        <w:t>similar to</w:t>
+      </w:r>
+      <w:proofErr w:type="gramEnd"/>
+      <w:r>
+        <w:rPr>
+          <w:sz w:val="24"/>
+          <w:szCs w:val="24"/>
+        </w:rPr>
+        <w:t xml:space="preserve"> the results above. </w:t>
       </w:r>
     </w:p>
     <w:p>
@@ -5849,6 +6009,7 @@
         </w:rPr>
         <w:t xml:space="preserve"> (</w:t>
       </w:r>
+      <w:proofErr w:type="gramStart"/>
       <w:r>
         <w:rPr>
           <w:sz w:val="24"/>
@@ -5877,7 +6038,15 @@
           <w:sz w:val="24"/>
           <w:szCs w:val="24"/>
         </w:rPr>
-        <w:t xml:space="preserve">                          </w:t>
+        <w:t xml:space="preserve"> </w:t>
+      </w:r>
+      <w:proofErr w:type="gramEnd"/>
+      <w:r>
+        <w:rPr>
+          <w:sz w:val="24"/>
+          <w:szCs w:val="24"/>
+        </w:rPr>
+        <w:t xml:space="preserve">                         </w:t>
       </w:r>
       <w:r>
         <w:rPr>
@@ -6124,6 +6293,7 @@
           <w:szCs w:val="24"/>
         </w:rPr>
       </w:pPr>
+      <w:proofErr w:type="gramStart"/>
       <w:r>
         <w:rPr>
           <w:sz w:val="24"/>
@@ -6138,6 +6308,7 @@
         </w:rPr>
         <w:tab/>
       </w:r>
+      <w:proofErr w:type="gramEnd"/>
       <w:r>
         <w:rPr>
           <w:sz w:val="24"/>
@@ -6214,6 +6385,7 @@
           <w:szCs w:val="24"/>
         </w:rPr>
       </w:pPr>
+      <w:proofErr w:type="gramStart"/>
       <w:r>
         <w:rPr>
           <w:sz w:val="24"/>
@@ -6228,6 +6400,7 @@
         </w:rPr>
         <w:tab/>
       </w:r>
+      <w:proofErr w:type="gramEnd"/>
       <w:r>
         <w:rPr>
           <w:sz w:val="24"/>
@@ -6311,6 +6484,7 @@
           <w:szCs w:val="24"/>
         </w:rPr>
       </w:pPr>
+      <w:proofErr w:type="gramStart"/>
       <w:r>
         <w:rPr>
           <w:sz w:val="24"/>
@@ -6325,6 +6499,7 @@
         </w:rPr>
         <w:tab/>
       </w:r>
+      <w:proofErr w:type="gramEnd"/>
       <w:r>
         <w:rPr>
           <w:sz w:val="24"/>
@@ -6401,6 +6576,7 @@
           <w:szCs w:val="24"/>
         </w:rPr>
       </w:pPr>
+      <w:proofErr w:type="gramStart"/>
       <w:r>
         <w:rPr>
           <w:sz w:val="24"/>
@@ -6415,6 +6591,7 @@
         </w:rPr>
         <w:tab/>
       </w:r>
+      <w:proofErr w:type="gramEnd"/>
       <w:r>
         <w:rPr>
           <w:sz w:val="24"/>
@@ -6491,6 +6668,7 @@
           <w:szCs w:val="24"/>
         </w:rPr>
       </w:pPr>
+      <w:proofErr w:type="gramStart"/>
       <w:r>
         <w:rPr>
           <w:sz w:val="24"/>
@@ -6505,6 +6683,7 @@
         </w:rPr>
         <w:tab/>
       </w:r>
+      <w:proofErr w:type="gramEnd"/>
       <w:r>
         <w:rPr>
           <w:sz w:val="24"/>
@@ -6581,6 +6760,7 @@
           <w:szCs w:val="24"/>
         </w:rPr>
       </w:pPr>
+      <w:proofErr w:type="gramStart"/>
       <w:r>
         <w:rPr>
           <w:sz w:val="24"/>
@@ -6595,6 +6775,7 @@
         </w:rPr>
         <w:tab/>
       </w:r>
+      <w:proofErr w:type="gramEnd"/>
       <w:r>
         <w:rPr>
           <w:sz w:val="24"/>
@@ -6678,6 +6859,7 @@
           <w:szCs w:val="24"/>
         </w:rPr>
       </w:pPr>
+      <w:proofErr w:type="gramStart"/>
       <w:r>
         <w:rPr>
           <w:sz w:val="24"/>
@@ -6692,6 +6874,7 @@
         </w:rPr>
         <w:tab/>
       </w:r>
+      <w:proofErr w:type="gramEnd"/>
       <w:r>
         <w:rPr>
           <w:sz w:val="24"/>
@@ -7190,6 +7373,7 @@
       </w:pPr>
       <w:r>
         <w:rPr>
+          <w:noProof/>
           <w:sz w:val="24"/>
           <w:szCs w:val="24"/>
         </w:rPr>
@@ -7209,7 +7393,7 @@
                     <pic:cNvPicPr/>
                   </pic:nvPicPr>
                   <pic:blipFill>
-                    <a:blip r:embed="rId10"/>
+                    <a:blip r:embed="rId12"/>
                     <a:stretch>
                       <a:fillRect/>
                     </a:stretch>
@@ -7240,6 +7424,7 @@
       </w:pPr>
       <w:r>
         <w:rPr>
+          <w:noProof/>
           <w:sz w:val="24"/>
           <w:szCs w:val="24"/>
         </w:rPr>
@@ -7259,7 +7444,7 @@
                     <pic:cNvPicPr/>
                   </pic:nvPicPr>
                   <pic:blipFill>
-                    <a:blip r:embed="rId11"/>
+                    <a:blip r:embed="rId13"/>
                     <a:stretch>
                       <a:fillRect/>
                     </a:stretch>
@@ -8821,7 +9006,23 @@
           <w:sz w:val="24"/>
           <w:szCs w:val="24"/>
         </w:rPr>
-        <w:t xml:space="preserve">and is a really fun way to gain understanding of the cross overs between electromagnetism and acoustics. </w:t>
+        <w:t xml:space="preserve">and is a </w:t>
+      </w:r>
+      <w:proofErr w:type="gramStart"/>
+      <w:r>
+        <w:rPr>
+          <w:sz w:val="24"/>
+          <w:szCs w:val="24"/>
+        </w:rPr>
+        <w:t>really fun</w:t>
+      </w:r>
+      <w:proofErr w:type="gramEnd"/>
+      <w:r>
+        <w:rPr>
+          <w:sz w:val="24"/>
+          <w:szCs w:val="24"/>
+        </w:rPr>
+        <w:t xml:space="preserve"> way to gain understanding of the cross overs between electromagnetism and acoustics. </w:t>
       </w:r>
     </w:p>
     <w:p>
@@ -8884,7 +9085,23 @@
           <w:sz w:val="24"/>
           <w:szCs w:val="24"/>
         </w:rPr>
-        <w:t xml:space="preserve">Again, the results of this part of the lab was satisfactory. </w:t>
+        <w:t xml:space="preserve">Again, the results of this part of the lab </w:t>
+      </w:r>
+      <w:proofErr w:type="gramStart"/>
+      <w:r>
+        <w:rPr>
+          <w:sz w:val="24"/>
+          <w:szCs w:val="24"/>
+        </w:rPr>
+        <w:t>was</w:t>
+      </w:r>
+      <w:proofErr w:type="gramEnd"/>
+      <w:r>
+        <w:rPr>
+          <w:sz w:val="24"/>
+          <w:szCs w:val="24"/>
+        </w:rPr>
+        <w:t xml:space="preserve"> satisfactory. </w:t>
       </w:r>
       <w:r>
         <w:rPr>
@@ -9141,7 +9358,23 @@
           <w:sz w:val="28"/>
           <w:szCs w:val="28"/>
         </w:rPr>
-        <w:t xml:space="preserve">Without a box the speaker has to perform more work </w:t>
+        <w:t xml:space="preserve">Without a box the speaker </w:t>
+      </w:r>
+      <w:proofErr w:type="gramStart"/>
+      <w:r>
+        <w:rPr>
+          <w:sz w:val="28"/>
+          <w:szCs w:val="28"/>
+        </w:rPr>
+        <w:t>has to</w:t>
+      </w:r>
+      <w:proofErr w:type="gramEnd"/>
+      <w:r>
+        <w:rPr>
+          <w:sz w:val="28"/>
+          <w:szCs w:val="28"/>
+        </w:rPr>
+        <w:t xml:space="preserve"> perform more work </w:t>
       </w:r>
       <w:r>
         <w:rPr>
@@ -9191,7 +9424,39 @@
           <w:sz w:val="28"/>
           <w:szCs w:val="28"/>
         </w:rPr>
-        <w:t xml:space="preserve">The air inside of the box acts as a spring </w:t>
+        <w:t xml:space="preserve">The air inside of the box acts </w:t>
+      </w:r>
+      <w:proofErr w:type="gramStart"/>
+      <w:r>
+        <w:rPr>
+          <w:sz w:val="28"/>
+          <w:szCs w:val="28"/>
+        </w:rPr>
+        <w:t>as</w:t>
+      </w:r>
+      <w:proofErr w:type="gramEnd"/>
+      <w:r>
+        <w:rPr>
+          <w:sz w:val="28"/>
+          <w:szCs w:val="28"/>
+        </w:rPr>
+        <w:t xml:space="preserve"> </w:t>
+      </w:r>
+      <w:proofErr w:type="gramStart"/>
+      <w:r>
+        <w:rPr>
+          <w:sz w:val="28"/>
+          <w:szCs w:val="28"/>
+        </w:rPr>
+        <w:t>a spring</w:t>
+      </w:r>
+      <w:proofErr w:type="gramEnd"/>
+      <w:r>
+        <w:rPr>
+          <w:sz w:val="28"/>
+          <w:szCs w:val="28"/>
+        </w:rPr>
+        <w:t xml:space="preserve"> </w:t>
       </w:r>
       <w:r>
         <w:rPr>
@@ -9205,7 +9470,39 @@
           <w:sz w:val="28"/>
           <w:szCs w:val="28"/>
         </w:rPr>
-        <w:t xml:space="preserve">Now without stuffing its good, but adding stuffing helps to absorb any sound inside of the box that could mess with the sound quality. </w:t>
+        <w:t xml:space="preserve">Now without stuffing </w:t>
+      </w:r>
+      <w:proofErr w:type="gramStart"/>
+      <w:r>
+        <w:rPr>
+          <w:sz w:val="28"/>
+          <w:szCs w:val="28"/>
+        </w:rPr>
+        <w:t>its</w:t>
+      </w:r>
+      <w:proofErr w:type="gramEnd"/>
+      <w:r>
+        <w:rPr>
+          <w:sz w:val="28"/>
+          <w:szCs w:val="28"/>
+        </w:rPr>
+        <w:t xml:space="preserve"> </w:t>
+      </w:r>
+      <w:proofErr w:type="gramStart"/>
+      <w:r>
+        <w:rPr>
+          <w:sz w:val="28"/>
+          <w:szCs w:val="28"/>
+        </w:rPr>
+        <w:t>good, but</w:t>
+      </w:r>
+      <w:proofErr w:type="gramEnd"/>
+      <w:r>
+        <w:rPr>
+          <w:sz w:val="28"/>
+          <w:szCs w:val="28"/>
+        </w:rPr>
+        <w:t xml:space="preserve"> adding stuffing helps to absorb any sound inside of the box that could mess with the sound quality. </w:t>
       </w:r>
       <w:r>
         <w:rPr>
@@ -9298,7 +9595,23 @@
           <w:sz w:val="28"/>
           <w:szCs w:val="28"/>
         </w:rPr>
-        <w:t xml:space="preserve"> this was a fun lab and gives insights to </w:t>
+        <w:t xml:space="preserve"> this was a fun lab and gives insights </w:t>
+      </w:r>
+      <w:proofErr w:type="gramStart"/>
+      <w:r>
+        <w:rPr>
+          <w:sz w:val="28"/>
+          <w:szCs w:val="28"/>
+        </w:rPr>
+        <w:t>to</w:t>
+      </w:r>
+      <w:proofErr w:type="gramEnd"/>
+      <w:r>
+        <w:rPr>
+          <w:sz w:val="28"/>
+          <w:szCs w:val="28"/>
+        </w:rPr>
+        <w:t xml:space="preserve"> </w:t>
       </w:r>
       <w:r>
         <w:rPr>
@@ -9430,8 +9743,17 @@
           <w:sz w:val="24"/>
           <w:szCs w:val="24"/>
         </w:rPr>
-        <w:t>with proper referencing</w:t>
-      </w:r>
+        <w:t xml:space="preserve">with proper </w:t>
+      </w:r>
+      <w:proofErr w:type="gramStart"/>
+      <w:r>
+        <w:rPr>
+          <w:sz w:val="24"/>
+          <w:szCs w:val="24"/>
+        </w:rPr>
+        <w:t>referencing</w:t>
+      </w:r>
+      <w:proofErr w:type="gramEnd"/>
     </w:p>
     <w:p>
       <w:pPr>
@@ -9572,7 +9894,7 @@
       </w:pPr>
     </w:p>
     <w:sectPr>
-      <w:footerReference w:type="first" r:id="rId12"/>
+      <w:footerReference w:type="first" r:id="rId14"/>
       <w:type w:val="continuous"/>
       <w:pgSz w:w="12240" w:h="15840" w:code="1"/>
       <w:pgMar w:top="1080" w:right="893" w:bottom="1440" w:left="893" w:header="720" w:footer="720" w:gutter="0"/>
@@ -9581,6 +9903,25 @@
     </w:sectPr>
   </w:body>
 </w:document>
+</file>
+
+<file path=word/endnotes.xml><?xml version="1.0" encoding="utf-8"?>
+<w:endnotes xmlns:wpc="http://schemas.microsoft.com/office/word/2010/wordprocessingCanvas" xmlns:cx="http://schemas.microsoft.com/office/drawing/2014/chartex" xmlns:cx1="http://schemas.microsoft.com/office/drawing/2015/9/8/chartex" xmlns:cx2="http://schemas.microsoft.com/office/drawing/2015/10/21/chartex" xmlns:cx3="http://schemas.microsoft.com/office/drawing/2016/5/9/chartex" xmlns:cx4="http://schemas.microsoft.com/office/drawing/2016/5/10/chartex" xmlns:cx5="http://schemas.microsoft.com/office/drawing/2016/5/11/chartex" xmlns:cx6="http://schemas.microsoft.com/office/drawing/2016/5/12/chartex" xmlns:cx7="http://schemas.microsoft.com/office/drawing/2016/5/13/chartex" xmlns:cx8="http://schemas.microsoft.com/office/drawing/2016/5/14/chartex" xmlns:mc="http://schemas.openxmlformats.org/markup-compatibility/2006" xmlns:aink="http://schemas.microsoft.com/office/drawing/2016/ink" xmlns:am3d="http://schemas.microsoft.com/office/drawing/2017/model3d" xmlns:o="urn:schemas-microsoft-com:office:office" xmlns:oel="http://schemas.microsoft.com/office/2019/extlst" xmlns:r="http://schemas.openxmlformats.org/officeDocument/2006/relationships" xmlns:m="http://schemas.openxmlformats.org/officeDocument/2006/math" xmlns:v="urn:schemas-microsoft-com:vml" xmlns:wp14="http://schemas.microsoft.com/office/word/2010/wordprocessingDrawing" xmlns:wp="http://schemas.openxmlformats.org/drawingml/2006/wordprocessingDrawing" xmlns:w10="urn:schemas-microsoft-com:office:word" xmlns:w="http://schemas.openxmlformats.org/wordprocessingml/2006/main" xmlns:w14="http://schemas.microsoft.com/office/word/2010/wordml" xmlns:w15="http://schemas.microsoft.com/office/word/2012/wordml" xmlns:w16cex="http://schemas.microsoft.com/office/word/2018/wordml/cex" xmlns:w16cid="http://schemas.microsoft.com/office/word/2016/wordml/cid" xmlns:w16="http://schemas.microsoft.com/office/word/2018/wordml" xmlns:w16du="http://schemas.microsoft.com/office/word/2023/wordml/word16du" xmlns:w16sdtdh="http://schemas.microsoft.com/office/word/2020/wordml/sdtdatahash" xmlns:w16sdtfl="http://schemas.microsoft.com/office/word/2024/wordml/sdtformatlock" xmlns:w16se="http://schemas.microsoft.com/office/word/2015/wordml/symex" xmlns:wpg="http://schemas.microsoft.com/office/word/2010/wordprocessingGroup" xmlns:wpi="http://schemas.microsoft.com/office/word/2010/wordprocessingInk" xmlns:wne="http://schemas.microsoft.com/office/word/2006/wordml" xmlns:wps="http://schemas.microsoft.com/office/word/2010/wordprocessingShape" mc:Ignorable="w14 w15 w16se w16cid w16 w16cex w16sdtdh w16sdtfl w16du wp14">
+  <w:endnote w:type="separator" w:id="-1">
+    <w:p>
+      <w:r>
+        <w:separator/>
+      </w:r>
+    </w:p>
+  </w:endnote>
+  <w:endnote w:type="continuationSeparator" w:id="0">
+    <w:p>
+      <w:r>
+        <w:continuationSeparator/>
+      </w:r>
+    </w:p>
+  </w:endnote>
+</w:endnotes>
 </file>
 
 <file path=word/footer1.xml><?xml version="1.0" encoding="utf-8"?>
@@ -9603,6 +9944,25 @@
     </w:r>
   </w:p>
 </w:ftr>
+</file>
+
+<file path=word/footnotes.xml><?xml version="1.0" encoding="utf-8"?>
+<w:footnotes xmlns:wpc="http://schemas.microsoft.com/office/word/2010/wordprocessingCanvas" xmlns:cx="http://schemas.microsoft.com/office/drawing/2014/chartex" xmlns:cx1="http://schemas.microsoft.com/office/drawing/2015/9/8/chartex" xmlns:cx2="http://schemas.microsoft.com/office/drawing/2015/10/21/chartex" xmlns:cx3="http://schemas.microsoft.com/office/drawing/2016/5/9/chartex" xmlns:cx4="http://schemas.microsoft.com/office/drawing/2016/5/10/chartex" xmlns:cx5="http://schemas.microsoft.com/office/drawing/2016/5/11/chartex" xmlns:cx6="http://schemas.microsoft.com/office/drawing/2016/5/12/chartex" xmlns:cx7="http://schemas.microsoft.com/office/drawing/2016/5/13/chartex" xmlns:cx8="http://schemas.microsoft.com/office/drawing/2016/5/14/chartex" xmlns:mc="http://schemas.openxmlformats.org/markup-compatibility/2006" xmlns:aink="http://schemas.microsoft.com/office/drawing/2016/ink" xmlns:am3d="http://schemas.microsoft.com/office/drawing/2017/model3d" xmlns:o="urn:schemas-microsoft-com:office:office" xmlns:oel="http://schemas.microsoft.com/office/2019/extlst" xmlns:r="http://schemas.openxmlformats.org/officeDocument/2006/relationships" xmlns:m="http://schemas.openxmlformats.org/officeDocument/2006/math" xmlns:v="urn:schemas-microsoft-com:vml" xmlns:wp14="http://schemas.microsoft.com/office/word/2010/wordprocessingDrawing" xmlns:wp="http://schemas.openxmlformats.org/drawingml/2006/wordprocessingDrawing" xmlns:w10="urn:schemas-microsoft-com:office:word" xmlns:w="http://schemas.openxmlformats.org/wordprocessingml/2006/main" xmlns:w14="http://schemas.microsoft.com/office/word/2010/wordml" xmlns:w15="http://schemas.microsoft.com/office/word/2012/wordml" xmlns:w16cex="http://schemas.microsoft.com/office/word/2018/wordml/cex" xmlns:w16cid="http://schemas.microsoft.com/office/word/2016/wordml/cid" xmlns:w16="http://schemas.microsoft.com/office/word/2018/wordml" xmlns:w16du="http://schemas.microsoft.com/office/word/2023/wordml/word16du" xmlns:w16sdtdh="http://schemas.microsoft.com/office/word/2020/wordml/sdtdatahash" xmlns:w16sdtfl="http://schemas.microsoft.com/office/word/2024/wordml/sdtformatlock" xmlns:w16se="http://schemas.microsoft.com/office/word/2015/wordml/symex" xmlns:wpg="http://schemas.microsoft.com/office/word/2010/wordprocessingGroup" xmlns:wpi="http://schemas.microsoft.com/office/word/2010/wordprocessingInk" xmlns:wne="http://schemas.microsoft.com/office/word/2006/wordml" xmlns:wps="http://schemas.microsoft.com/office/word/2010/wordprocessingShape" mc:Ignorable="w14 w15 w16se w16cid w16 w16cex w16sdtdh w16sdtfl w16du wp14">
+  <w:footnote w:type="separator" w:id="-1">
+    <w:p>
+      <w:r>
+        <w:separator/>
+      </w:r>
+    </w:p>
+  </w:footnote>
+  <w:footnote w:type="continuationSeparator" w:id="0">
+    <w:p>
+      <w:r>
+        <w:continuationSeparator/>
+      </w:r>
+    </w:p>
+  </w:footnote>
+</w:footnotes>
 </file>
 
 <file path=word/numbering.xml><?xml version="1.0" encoding="utf-8"?>
@@ -12504,6 +12864,7 @@
   <w:style w:type="character" w:default="1" w:styleId="DefaultParagraphFont">
     <w:name w:val="Default Paragraph Font"/>
     <w:uiPriority w:val="1"/>
+    <w:semiHidden/>
     <w:unhideWhenUsed/>
   </w:style>
   <w:style w:type="table" w:default="1" w:styleId="TableNormal">
@@ -13275,7 +13636,10 @@
   </w:compat>
   <w:rsids>
     <w:rsidRoot w:val="00F95E66"/>
+    <w:rsid w:val="001A0FCA"/>
     <w:rsid w:val="009F60A8"/>
+    <w:rsid w:val="00A050C9"/>
+    <w:rsid w:val="00C53607"/>
     <w:rsid w:val="00F95E66"/>
     <w:rsid w:val="00FD627F"/>
   </w:rsids>

</xml_diff>